<commit_message>
Add PiN parameters step 1 hybrid for Central_African_Republic___CAR
</commit_message>
<xml_diff>
--- a/platform_PiN_output/Central_African_Republic___CAR/Param_step1_Central_African_Republic___CAR_1008_03PM.docx
+++ b/platform_PiN_output/Central_African_Republic___CAR/Param_step1_Central_African_Republic___CAR_1008_03PM.docx
@@ -31,7 +31,7 @@
         <w:pStyle w:val="ListBullet"/>
       </w:pPr>
       <w:r>
-        <w:t>Date calculation: 08/10/2025 15:06</w:t>
+        <w:t>Date calculation: 08/10/2025 15:26</w:t>
       </w:r>
     </w:p>
     <w:p>
@@ -77,7 +77,7 @@
         <w:pStyle w:val="ListBullet2"/>
       </w:pPr>
       <w:r>
-        <w:t xml:space="preserve">      Education disrupted due to natural hazard: no_indicator</w:t>
+        <w:t xml:space="preserve">      Education disrupted due to natural hazard: edu_disrupted_hazards</w:t>
       </w:r>
     </w:p>
     <w:p>
@@ -104,7 +104,7 @@
         <w:pStyle w:val="ListBullet2"/>
       </w:pPr>
       <w:r>
-        <w:t xml:space="preserve">      Education disrupted due to school being occupied by armed groups: no_indicator</w:t>
+        <w:t xml:space="preserve">      Education disrupted due to school being occupied by armed groups: edu_disrupted_attack</w:t>
       </w:r>
     </w:p>
     <w:p>
@@ -153,7 +153,7 @@
         <w:rPr>
           <w:b/>
         </w:rPr>
-        <w:t>no_indicator</w:t>
+        <w:t>edu_disrupted_hazards</w:t>
       </w:r>
       <w:r>
         <w:t>.</w:t>
@@ -188,7 +188,7 @@
         <w:pStyle w:val="ListBullet2"/>
       </w:pPr>
       <w:r>
-        <w:t xml:space="preserve">      Le programme scolaire et/ou les certificats délivrés par l'école ne sont pas perçus comme utiles pour le ménage.  </w:t>
+        <w:t xml:space="preserve">      Manque d'intérêt pour l'éducation formelle</w:t>
       </w:r>
     </w:p>
     <w:p>
@@ -196,7 +196,7 @@
         <w:pStyle w:val="ListBullet2"/>
       </w:pPr>
       <w:r>
-        <w:t xml:space="preserve">      Impossibilité de payer les coûts directs de l'éducation (par exemple, les frais de scolarité, les fournitures, le transport)</w:t>
+        <w:t xml:space="preserve">      Absence d'école appropriée et accessible</w:t>
       </w:r>
     </w:p>
     <w:p>
@@ -204,23 +204,7 @@
         <w:pStyle w:val="ListBullet2"/>
       </w:pPr>
       <w:r>
-        <w:t xml:space="preserve">      L'enfant doit travailler à la maison ou dans la ferme du ménage (c'est-à-dire qu'il ne gagne pas de revenu pour ces activités, mais peut permettre à d'autres membres de la famille de gagner un revenu)</w:t>
-      </w:r>
-    </w:p>
-    <w:p>
-      <w:pPr>
-        <w:pStyle w:val="ListBullet2"/>
-      </w:pPr>
-      <w:r>
-        <w:t xml:space="preserve">      L'enfant participe à des activités génératrices de revenus en dehors du foyer</w:t>
-      </w:r>
-    </w:p>
-    <w:p>
-      <w:pPr>
-        <w:pStyle w:val="ListBullet2"/>
-      </w:pPr>
-      <w:r>
-        <w:t xml:space="preserve">      Manque d'enseignants ou qualité médiocre des enseignants</w:t>
+        <w:t xml:space="preserve">      L'école a été fermée en raison de dommages, d'une catastrophe naturelle ou d'un conflit.</w:t>
       </w:r>
     </w:p>
     <w:p>
@@ -241,7 +225,7 @@
         <w:rPr>
           <w:b/>
         </w:rPr>
-        <w:t>no_indicator</w:t>
+        <w:t>edu_disrupted_attack</w:t>
       </w:r>
       <w:r>
         <w:t xml:space="preserve"> or OoS facing the following aggravating circumstances.</w:t>
@@ -252,7 +236,7 @@
         <w:pStyle w:val="ListBullet2"/>
       </w:pPr>
       <w:r>
-        <w:t xml:space="preserve">      L'éducation n'est pas une priorité pour l'enfant ou le ménage</w:t>
+        <w:t xml:space="preserve">      Manque d'enseignants ou qualité médiocre des enseignants</w:t>
       </w:r>
     </w:p>
     <w:p>
@@ -260,7 +244,7 @@
         <w:pStyle w:val="ListBullet2"/>
       </w:pPr>
       <w:r>
-        <w:t xml:space="preserve">      L'enfant est associé à des forces armées ou à des groupes armés </w:t>
+        <w:t xml:space="preserve">      Le programme scolaire et/ou les certificats délivrés par l'école ne sont pas perçus comme utiles pour le ménage.  </w:t>
       </w:r>
     </w:p>
     <w:p>
@@ -268,7 +252,7 @@
         <w:pStyle w:val="ListBullet2"/>
       </w:pPr>
       <w:r>
-        <w:t xml:space="preserve">      Mariage ou fiançailles</w:t>
+        <w:t xml:space="preserve">      Impossibilité de payer les coûts directs de l'éducation (par exemple, les frais de scolarité, les fournitures, le transport)</w:t>
       </w:r>
     </w:p>
     <w:p>

</xml_diff>